<commit_message>
final update of swagger
</commit_message>
<xml_diff>
--- a/School Enrolment Project Spring.docx
+++ b/School Enrolment Project Spring.docx
@@ -4344,6 +4344,43 @@
         <w:t xml:space="preserve"> Module</w:t>
       </w:r>
     </w:p>
+    <w:p>
+      <w:pPr>
+        <w:spacing w:before="100" w:beforeAutospacing="1" w:after="100" w:afterAutospacing="1" w:line="240" w:lineRule="auto"/>
+        <w:outlineLvl w:val="2"/>
+        <w:rPr>
+          <w:rFonts w:ascii="Times New Roman" w:eastAsia="Times New Roman" w:hAnsi="Times New Roman" w:cs="Times New Roman"/>
+          <w:b/>
+          <w:bCs/>
+          <w:sz w:val="27"/>
+          <w:szCs w:val="27"/>
+          <w:lang w:eastAsia="en-IN"/>
+        </w:rPr>
+      </w:pPr>
+    </w:p>
+    <w:p>
+      <w:pPr>
+        <w:spacing w:before="100" w:beforeAutospacing="1" w:after="100" w:afterAutospacing="1" w:line="240" w:lineRule="auto"/>
+        <w:outlineLvl w:val="2"/>
+        <w:rPr>
+          <w:rFonts w:ascii="Times New Roman" w:eastAsia="Times New Roman" w:hAnsi="Times New Roman" w:cs="Times New Roman"/>
+          <w:bCs/>
+          <w:sz w:val="27"/>
+          <w:szCs w:val="27"/>
+          <w:lang w:eastAsia="en-IN"/>
+        </w:rPr>
+      </w:pPr>
+      <w:r>
+        <w:rPr>
+          <w:rFonts w:ascii="Times New Roman" w:eastAsia="Times New Roman" w:hAnsi="Times New Roman" w:cs="Times New Roman"/>
+          <w:bCs/>
+          <w:sz w:val="27"/>
+          <w:szCs w:val="27"/>
+          <w:lang w:eastAsia="en-IN"/>
+        </w:rPr>
+        <w:t xml:space="preserve">Student must registered the department then only they can able to register the courses </w:t>
+      </w:r>
+    </w:p>
     <w:tbl>
       <w:tblPr>
         <w:tblW w:w="0" w:type="auto"/>
@@ -4848,6 +4885,7 @@
                 <w:szCs w:val="24"/>
                 <w:lang w:eastAsia="en-IN"/>
               </w:rPr>
+              <w:lastRenderedPageBreak/>
               <w:t>GET</w:t>
             </w:r>
           </w:p>
@@ -5355,7 +5393,6 @@
                 <w:szCs w:val="24"/>
                 <w:lang w:eastAsia="en-IN"/>
               </w:rPr>
-              <w:lastRenderedPageBreak/>
               <w:t>PUT</w:t>
             </w:r>
           </w:p>
@@ -8216,6 +8253,7 @@
           <w:szCs w:val="27"/>
           <w:lang w:eastAsia="en-IN"/>
         </w:rPr>
+        <w:lastRenderedPageBreak/>
         <w:t>🔐</w:t>
       </w:r>
       <w:r>
@@ -8721,7 +8759,6 @@
                 <w:szCs w:val="24"/>
                 <w:lang w:eastAsia="en-IN"/>
               </w:rPr>
-              <w:lastRenderedPageBreak/>
               <w:t>GET</w:t>
             </w:r>
           </w:p>
@@ -10122,6 +10159,7 @@
                 <w:rStyle w:val="HTMLCode"/>
                 <w:rFonts w:eastAsiaTheme="minorHAnsi"/>
               </w:rPr>
+              <w:lastRenderedPageBreak/>
               <w:t>address</w:t>
             </w:r>
           </w:p>
@@ -10212,7 +10250,6 @@
                 <w:rStyle w:val="HTMLCode"/>
                 <w:rFonts w:eastAsiaTheme="minorHAnsi"/>
               </w:rPr>
-              <w:lastRenderedPageBreak/>
               <w:t>state</w:t>
             </w:r>
           </w:p>
@@ -11255,6 +11292,7 @@
                 <w:rStyle w:val="HTMLCode"/>
                 <w:rFonts w:eastAsiaTheme="minorHAnsi"/>
               </w:rPr>
+              <w:lastRenderedPageBreak/>
               <w:t>createdAt</w:t>
             </w:r>
             <w:proofErr w:type="spellEnd"/>
@@ -11352,7 +11390,6 @@
         <w:rPr>
           <w:rFonts w:ascii="Segoe UI Symbol" w:hAnsi="Segoe UI Symbol" w:cs="Segoe UI Symbol"/>
         </w:rPr>
-        <w:lastRenderedPageBreak/>
         <w:t>👨</w:t>
       </w:r>
       <w:r>
@@ -12341,6 +12378,7 @@
                 <w:b/>
                 <w:bCs/>
               </w:rPr>
+              <w:lastRenderedPageBreak/>
               <w:t>Field</w:t>
             </w:r>
           </w:p>
@@ -12500,7 +12538,6 @@
                 <w:rStyle w:val="HTMLCode"/>
                 <w:rFonts w:eastAsiaTheme="minorHAnsi"/>
               </w:rPr>
-              <w:lastRenderedPageBreak/>
               <w:t>course</w:t>
             </w:r>
           </w:p>
@@ -13526,6 +13563,7 @@
         <w:rPr>
           <w:rFonts w:ascii="Segoe UI Symbol" w:hAnsi="Segoe UI Symbol" w:cs="Segoe UI Symbol"/>
         </w:rPr>
+        <w:lastRenderedPageBreak/>
         <w:t>👑</w:t>
       </w:r>
       <w:r>
@@ -13545,7 +13583,6 @@
         <w:pStyle w:val="NormalWeb"/>
       </w:pPr>
       <w:r>
-        <w:lastRenderedPageBreak/>
         <w:t xml:space="preserve">If you implement </w:t>
       </w:r>
       <w:r>
@@ -14276,6 +14313,7 @@
                 <w:b/>
                 <w:bCs/>
               </w:rPr>
+              <w:lastRenderedPageBreak/>
               <w:t>Entity</w:t>
             </w:r>
           </w:p>
@@ -14380,7 +14418,6 @@
           </w:tcPr>
           <w:p>
             <w:r>
-              <w:lastRenderedPageBreak/>
               <w:t xml:space="preserve">Student ↔ </w:t>
             </w:r>
             <w:proofErr w:type="spellStart"/>
@@ -14692,6 +14729,57 @@
         </w:tc>
       </w:tr>
     </w:tbl>
+    <w:p/>
+    <w:p/>
+    <w:p/>
+    <w:p/>
+    <w:p/>
+    <w:p/>
+    <w:p/>
+    <w:p/>
+    <w:p/>
+    <w:p/>
+    <w:p/>
+    <w:p/>
+    <w:p/>
+    <w:p/>
+    <w:p/>
+    <w:p/>
+    <w:p>
+      <w:r>
+        <w:lastRenderedPageBreak/>
+        <w:t xml:space="preserve">Future </w:t>
+      </w:r>
+      <w:proofErr w:type="gramStart"/>
+      <w:r>
+        <w:t>Implementation :</w:t>
+      </w:r>
+      <w:proofErr w:type="gramEnd"/>
+    </w:p>
+    <w:p/>
+    <w:p>
+      <w:r>
+        <w:t xml:space="preserve">If we want to </w:t>
+      </w:r>
+      <w:proofErr w:type="spellStart"/>
+      <w:r>
+        <w:t>increased</w:t>
+      </w:r>
+      <w:proofErr w:type="spellEnd"/>
+      <w:r>
+        <w:t xml:space="preserve"> the department size capacity we should have to </w:t>
+      </w:r>
+      <w:proofErr w:type="spellStart"/>
+      <w:r>
+        <w:t>structurize</w:t>
+      </w:r>
+      <w:proofErr w:type="spellEnd"/>
+      <w:r>
+        <w:t xml:space="preserve"> the department course registration like two set </w:t>
+      </w:r>
+      <w:bookmarkStart w:id="0" w:name="_GoBack"/>
+      <w:bookmarkEnd w:id="0"/>
+    </w:p>
     <w:p/>
     <w:p/>
     <w:p/>
@@ -14724,23 +14812,6 @@
     <w:p/>
     <w:p/>
     <w:p/>
-    <w:p/>
-    <w:p/>
-    <w:p/>
-    <w:p/>
-    <w:p/>
-    <w:p/>
-    <w:p/>
-    <w:p/>
-    <w:p/>
-    <w:p/>
-    <w:p/>
-    <w:p/>
-    <w:p/>
-    <w:p/>
-    <w:p/>
-    <w:p/>
-    <w:p/>
     <w:p>
       <w:pPr>
         <w:pStyle w:val="Heading3"/>
@@ -15739,6 +15810,7 @@
         <w:rPr>
           <w:rStyle w:val="HTMLCode"/>
         </w:rPr>
+        <w:lastRenderedPageBreak/>
         <w:t xml:space="preserve">    </w:t>
       </w:r>
       <w:proofErr w:type="gramStart"/>
@@ -16079,7 +16151,6 @@
         <w:rPr>
           <w:rStyle w:val="HTMLCode"/>
         </w:rPr>
-        <w:lastRenderedPageBreak/>
         <w:t xml:space="preserve">    </w:t>
       </w:r>
       <w:proofErr w:type="gramStart"/>
@@ -17502,6 +17573,7 @@
         <w:rPr>
           <w:rStyle w:val="HTMLCode"/>
         </w:rPr>
+        <w:lastRenderedPageBreak/>
         <w:t xml:space="preserve">    </w:t>
       </w:r>
       <w:proofErr w:type="gramStart"/>
@@ -19237,6 +19309,7 @@
         <w:rPr>
           <w:rFonts w:ascii="Segoe UI Symbol" w:hAnsi="Segoe UI Symbol" w:cs="Segoe UI Symbol"/>
         </w:rPr>
+        <w:lastRenderedPageBreak/>
         <w:t>⚙</w:t>
       </w:r>
       <w:r>
@@ -21274,6 +21347,7 @@
         <w:rPr>
           <w:rStyle w:val="HTMLCode"/>
         </w:rPr>
+        <w:lastRenderedPageBreak/>
         <w:t xml:space="preserve">        </w:t>
       </w:r>
       <w:proofErr w:type="spellStart"/>
@@ -23559,6 +23633,7 @@
         <w:rPr>
           <w:rStyle w:val="HTMLCode"/>
         </w:rPr>
+        <w:lastRenderedPageBreak/>
         <w:t xml:space="preserve">            </w:t>
       </w:r>
       <w:r>
@@ -23824,7 +23899,6 @@
         <w:rPr>
           <w:rStyle w:val="HTMLCode"/>
         </w:rPr>
-        <w:lastRenderedPageBreak/>
         <w:t xml:space="preserve">    </w:t>
       </w:r>
       <w:proofErr w:type="gramStart"/>
@@ -25443,10 +25517,7 @@
         <w:t>"2025-10-29T15:25:13"</w:t>
       </w:r>
     </w:p>
-    <w:p>
-      <w:bookmarkStart w:id="0" w:name="_GoBack"/>
-      <w:bookmarkEnd w:id="0"/>
-    </w:p>
+    <w:p/>
     <w:sectPr>
       <w:pgSz w:w="11906" w:h="16838"/>
       <w:pgMar w:top="1440" w:right="1440" w:bottom="1440" w:left="1440" w:header="708" w:footer="708" w:gutter="0"/>

</xml_diff>

<commit_message>
saving my current work
</commit_message>
<xml_diff>
--- a/School Enrolment Project Spring.docx
+++ b/School Enrolment Project Spring.docx
@@ -4344,6 +4344,43 @@
         <w:t xml:space="preserve"> Module</w:t>
       </w:r>
     </w:p>
+    <w:p>
+      <w:pPr>
+        <w:spacing w:before="100" w:beforeAutospacing="1" w:after="100" w:afterAutospacing="1" w:line="240" w:lineRule="auto"/>
+        <w:outlineLvl w:val="2"/>
+        <w:rPr>
+          <w:rFonts w:ascii="Times New Roman" w:eastAsia="Times New Roman" w:hAnsi="Times New Roman" w:cs="Times New Roman"/>
+          <w:b/>
+          <w:bCs/>
+          <w:sz w:val="27"/>
+          <w:szCs w:val="27"/>
+          <w:lang w:eastAsia="en-IN"/>
+        </w:rPr>
+      </w:pPr>
+    </w:p>
+    <w:p>
+      <w:pPr>
+        <w:spacing w:before="100" w:beforeAutospacing="1" w:after="100" w:afterAutospacing="1" w:line="240" w:lineRule="auto"/>
+        <w:outlineLvl w:val="2"/>
+        <w:rPr>
+          <w:rFonts w:ascii="Times New Roman" w:eastAsia="Times New Roman" w:hAnsi="Times New Roman" w:cs="Times New Roman"/>
+          <w:bCs/>
+          <w:sz w:val="27"/>
+          <w:szCs w:val="27"/>
+          <w:lang w:eastAsia="en-IN"/>
+        </w:rPr>
+      </w:pPr>
+      <w:r>
+        <w:rPr>
+          <w:rFonts w:ascii="Times New Roman" w:eastAsia="Times New Roman" w:hAnsi="Times New Roman" w:cs="Times New Roman"/>
+          <w:bCs/>
+          <w:sz w:val="27"/>
+          <w:szCs w:val="27"/>
+          <w:lang w:eastAsia="en-IN"/>
+        </w:rPr>
+        <w:t xml:space="preserve">Student must registered the department then only they can able to register the courses </w:t>
+      </w:r>
+    </w:p>
     <w:tbl>
       <w:tblPr>
         <w:tblW w:w="0" w:type="auto"/>
@@ -4848,6 +4885,7 @@
                 <w:szCs w:val="24"/>
                 <w:lang w:eastAsia="en-IN"/>
               </w:rPr>
+              <w:lastRenderedPageBreak/>
               <w:t>GET</w:t>
             </w:r>
           </w:p>
@@ -5355,7 +5393,6 @@
                 <w:szCs w:val="24"/>
                 <w:lang w:eastAsia="en-IN"/>
               </w:rPr>
-              <w:lastRenderedPageBreak/>
               <w:t>PUT</w:t>
             </w:r>
           </w:p>
@@ -8216,6 +8253,7 @@
           <w:szCs w:val="27"/>
           <w:lang w:eastAsia="en-IN"/>
         </w:rPr>
+        <w:lastRenderedPageBreak/>
         <w:t>🔐</w:t>
       </w:r>
       <w:r>
@@ -8721,7 +8759,6 @@
                 <w:szCs w:val="24"/>
                 <w:lang w:eastAsia="en-IN"/>
               </w:rPr>
-              <w:lastRenderedPageBreak/>
               <w:t>GET</w:t>
             </w:r>
           </w:p>
@@ -10122,6 +10159,7 @@
                 <w:rStyle w:val="HTMLCode"/>
                 <w:rFonts w:eastAsiaTheme="minorHAnsi"/>
               </w:rPr>
+              <w:lastRenderedPageBreak/>
               <w:t>address</w:t>
             </w:r>
           </w:p>
@@ -10212,7 +10250,6 @@
                 <w:rStyle w:val="HTMLCode"/>
                 <w:rFonts w:eastAsiaTheme="minorHAnsi"/>
               </w:rPr>
-              <w:lastRenderedPageBreak/>
               <w:t>state</w:t>
             </w:r>
           </w:p>
@@ -11255,6 +11292,7 @@
                 <w:rStyle w:val="HTMLCode"/>
                 <w:rFonts w:eastAsiaTheme="minorHAnsi"/>
               </w:rPr>
+              <w:lastRenderedPageBreak/>
               <w:t>createdAt</w:t>
             </w:r>
             <w:proofErr w:type="spellEnd"/>
@@ -11352,7 +11390,6 @@
         <w:rPr>
           <w:rFonts w:ascii="Segoe UI Symbol" w:hAnsi="Segoe UI Symbol" w:cs="Segoe UI Symbol"/>
         </w:rPr>
-        <w:lastRenderedPageBreak/>
         <w:t>👨</w:t>
       </w:r>
       <w:r>
@@ -12341,6 +12378,7 @@
                 <w:b/>
                 <w:bCs/>
               </w:rPr>
+              <w:lastRenderedPageBreak/>
               <w:t>Field</w:t>
             </w:r>
           </w:p>
@@ -12500,7 +12538,6 @@
                 <w:rStyle w:val="HTMLCode"/>
                 <w:rFonts w:eastAsiaTheme="minorHAnsi"/>
               </w:rPr>
-              <w:lastRenderedPageBreak/>
               <w:t>course</w:t>
             </w:r>
           </w:p>
@@ -13526,6 +13563,7 @@
         <w:rPr>
           <w:rFonts w:ascii="Segoe UI Symbol" w:hAnsi="Segoe UI Symbol" w:cs="Segoe UI Symbol"/>
         </w:rPr>
+        <w:lastRenderedPageBreak/>
         <w:t>👑</w:t>
       </w:r>
       <w:r>
@@ -13545,7 +13583,6 @@
         <w:pStyle w:val="NormalWeb"/>
       </w:pPr>
       <w:r>
-        <w:lastRenderedPageBreak/>
         <w:t xml:space="preserve">If you implement </w:t>
       </w:r>
       <w:r>
@@ -14276,6 +14313,7 @@
                 <w:b/>
                 <w:bCs/>
               </w:rPr>
+              <w:lastRenderedPageBreak/>
               <w:t>Entity</w:t>
             </w:r>
           </w:p>
@@ -14380,7 +14418,6 @@
           </w:tcPr>
           <w:p>
             <w:r>
-              <w:lastRenderedPageBreak/>
               <w:t xml:space="preserve">Student ↔ </w:t>
             </w:r>
             <w:proofErr w:type="spellStart"/>
@@ -14692,6 +14729,57 @@
         </w:tc>
       </w:tr>
     </w:tbl>
+    <w:p/>
+    <w:p/>
+    <w:p/>
+    <w:p/>
+    <w:p/>
+    <w:p/>
+    <w:p/>
+    <w:p/>
+    <w:p/>
+    <w:p/>
+    <w:p/>
+    <w:p/>
+    <w:p/>
+    <w:p/>
+    <w:p/>
+    <w:p/>
+    <w:p>
+      <w:r>
+        <w:lastRenderedPageBreak/>
+        <w:t xml:space="preserve">Future </w:t>
+      </w:r>
+      <w:proofErr w:type="gramStart"/>
+      <w:r>
+        <w:t>Implementation :</w:t>
+      </w:r>
+      <w:proofErr w:type="gramEnd"/>
+    </w:p>
+    <w:p/>
+    <w:p>
+      <w:r>
+        <w:t xml:space="preserve">If we want to </w:t>
+      </w:r>
+      <w:proofErr w:type="spellStart"/>
+      <w:r>
+        <w:t>increased</w:t>
+      </w:r>
+      <w:proofErr w:type="spellEnd"/>
+      <w:r>
+        <w:t xml:space="preserve"> the department size capacity we should have to </w:t>
+      </w:r>
+      <w:proofErr w:type="spellStart"/>
+      <w:r>
+        <w:t>structurize</w:t>
+      </w:r>
+      <w:proofErr w:type="spellEnd"/>
+      <w:r>
+        <w:t xml:space="preserve"> the department course registration like two set </w:t>
+      </w:r>
+      <w:bookmarkStart w:id="0" w:name="_GoBack"/>
+      <w:bookmarkEnd w:id="0"/>
+    </w:p>
     <w:p/>
     <w:p/>
     <w:p/>
@@ -14724,23 +14812,6 @@
     <w:p/>
     <w:p/>
     <w:p/>
-    <w:p/>
-    <w:p/>
-    <w:p/>
-    <w:p/>
-    <w:p/>
-    <w:p/>
-    <w:p/>
-    <w:p/>
-    <w:p/>
-    <w:p/>
-    <w:p/>
-    <w:p/>
-    <w:p/>
-    <w:p/>
-    <w:p/>
-    <w:p/>
-    <w:p/>
     <w:p>
       <w:pPr>
         <w:pStyle w:val="Heading3"/>
@@ -15739,6 +15810,7 @@
         <w:rPr>
           <w:rStyle w:val="HTMLCode"/>
         </w:rPr>
+        <w:lastRenderedPageBreak/>
         <w:t xml:space="preserve">    </w:t>
       </w:r>
       <w:proofErr w:type="gramStart"/>
@@ -16079,7 +16151,6 @@
         <w:rPr>
           <w:rStyle w:val="HTMLCode"/>
         </w:rPr>
-        <w:lastRenderedPageBreak/>
         <w:t xml:space="preserve">    </w:t>
       </w:r>
       <w:proofErr w:type="gramStart"/>
@@ -17502,6 +17573,7 @@
         <w:rPr>
           <w:rStyle w:val="HTMLCode"/>
         </w:rPr>
+        <w:lastRenderedPageBreak/>
         <w:t xml:space="preserve">    </w:t>
       </w:r>
       <w:proofErr w:type="gramStart"/>
@@ -19237,6 +19309,7 @@
         <w:rPr>
           <w:rFonts w:ascii="Segoe UI Symbol" w:hAnsi="Segoe UI Symbol" w:cs="Segoe UI Symbol"/>
         </w:rPr>
+        <w:lastRenderedPageBreak/>
         <w:t>⚙</w:t>
       </w:r>
       <w:r>
@@ -21274,6 +21347,7 @@
         <w:rPr>
           <w:rStyle w:val="HTMLCode"/>
         </w:rPr>
+        <w:lastRenderedPageBreak/>
         <w:t xml:space="preserve">        </w:t>
       </w:r>
       <w:proofErr w:type="spellStart"/>
@@ -23559,6 +23633,7 @@
         <w:rPr>
           <w:rStyle w:val="HTMLCode"/>
         </w:rPr>
+        <w:lastRenderedPageBreak/>
         <w:t xml:space="preserve">            </w:t>
       </w:r>
       <w:r>
@@ -23824,7 +23899,6 @@
         <w:rPr>
           <w:rStyle w:val="HTMLCode"/>
         </w:rPr>
-        <w:lastRenderedPageBreak/>
         <w:t xml:space="preserve">    </w:t>
       </w:r>
       <w:proofErr w:type="gramStart"/>
@@ -25443,10 +25517,7 @@
         <w:t>"2025-10-29T15:25:13"</w:t>
       </w:r>
     </w:p>
-    <w:p>
-      <w:bookmarkStart w:id="0" w:name="_GoBack"/>
-      <w:bookmarkEnd w:id="0"/>
-    </w:p>
+    <w:p/>
     <w:sectPr>
       <w:pgSz w:w="11906" w:h="16838"/>
       <w:pgMar w:top="1440" w:right="1440" w:bottom="1440" w:left="1440" w:header="708" w:footer="708" w:gutter="0"/>

</xml_diff>